<commit_message>
fix: localize Korean sample and complete DOCX visual QA
</commit_message>
<xml_diff>
--- a/tests/manual_samples/it-tools/output/manual.docx
+++ b/tests/manual_samples/it-tools/output/manual.docx
@@ -197,7 +197,7 @@
         <w:t xml:space="preserve">성공 기준: </w:t>
       </w:r>
       <w:r>
-        <w:t>示例 JSON 输入后，输出区域显示对应 YAML。该结果已在 IT Tools 公开部署页面观察到。</w:t>
+        <w:t>예시 JSON을 입력하면 출력 영역에 해당 YAML이 표시된다. 이 결과는 IT Tools 공개 배포 페이지에서 관찰했다.</w:t>
       </w:r>
     </w:p>
     <w:p>
@@ -255,7 +255,7 @@
         <w:t xml:space="preserve">예상 결과: </w:t>
       </w:r>
       <w:r>
-        <w:t>显示 JSON to YAML 工具标题和输入区域。</w:t>
+        <w:t>JSON to YAML 도구의 제목과 입력 영역이 표시된다.</w:t>
       </w:r>
     </w:p>
     <w:p>
@@ -269,7 +269,7 @@
         <w:t xml:space="preserve">실제 결과: </w:t>
       </w:r>
       <w:r>
-        <w:t>已打开 JSON to YAML converter 页面，显示标题和 JSON 输入区域。</w:t>
+        <w:t>JSON to YAML converter 페이지를 열어 제목과 JSON 입력 영역을 확인했다.</w:t>
       </w:r>
     </w:p>
     <w:p>
@@ -361,7 +361,7 @@
         <w:t xml:space="preserve">예상 결과: </w:t>
       </w:r>
       <w:r>
-        <w:t>输入框保留示例 JSON 内容。</w:t>
+        <w:t>입력란에 예시 JSON 내용이 유지된다.</w:t>
       </w:r>
     </w:p>
     <w:p>
@@ -375,7 +375,7 @@
         <w:t xml:space="preserve">실제 결과: </w:t>
       </w:r>
       <w:r>
-        <w:t>输入 {"service":"demo","enabled":true} 后，内容显示在 JSON 输入区域。</w:t>
+        <w:t>{"service":"demo","enabled":true}를 입력한 뒤 JSON 입력 영역에 내용이 표시되는 것을 확인했다.</w:t>
       </w:r>
     </w:p>
     <w:p>
@@ -467,7 +467,7 @@
         <w:t xml:space="preserve">예상 결과: </w:t>
       </w:r>
       <w:r>
-        <w:t>输出区显示等价的 YAML 文本。</w:t>
+        <w:t>출력 영역에 동등한 YAML 텍스트가 표시된다.</w:t>
       </w:r>
     </w:p>
     <w:p>
@@ -481,7 +481,7 @@
         <w:t xml:space="preserve">실제 결과: </w:t>
       </w:r>
       <w:r>
-        <w:t>输出区域显示 service: demo 与 enabled: true 两行 YAML。</w:t>
+        <w:t>출력 영역에 service: demo와 enabled: true의 YAML 두 줄이 표시되는 것을 확인했다.</w:t>
       </w:r>
     </w:p>
     <w:p>
@@ -1231,7 +1231,7 @@
         <w:pStyle w:val="ListBullet"/>
       </w:pPr>
       <w:r>
-        <w:t>本手册的源码索引固定到 commit d505845f918e946ec300af7b36efc107e2f66e9e；实测截图取自 IT Tools 公开部署页面，部署版本未与固定源码 commit 对齐。</w:t>
+        <w:t>이 설명서의 소스 코드 색인은 commit d505845f918e946ec300af7b36efc107e2f66e9e에 고정되어 있다. 실제 스크린샷은 IT Tools 공개 배포 페이지에서 가져왔으며 배포 버전과 고정한 소스 commit의 일치 여부는 확인하지 못했다.</w:t>
       </w:r>
     </w:p>
     <w:p>
@@ -1239,7 +1239,7 @@
         <w:pStyle w:val="ListBullet"/>
       </w:pPr>
       <w:r>
-        <w:t>仅 JSON→YAML 转换流程已在公开部署页面观察并截图验证；文本哈希和 QR 码流程仍为源码候选，未经界面操作验证。</w:t>
+        <w:t>JSON→YAML 변환 흐름만 공개 배포 페이지에서 관찰하고 스크린샷으로 검증했다. 텍스트 해시와 QR 코드 흐름은 소스 코드에서 추린 후보이며 UI에서 실제로 실행해 검증하지 않았다.</w:t>
       </w:r>
     </w:p>
     <w:sectPr>

</xml_diff>

<commit_message>
fix: localize Korean sample and complete DOCX visual QA (#14)
</commit_message>
<xml_diff>
--- a/tests/manual_samples/it-tools/output/manual.docx
+++ b/tests/manual_samples/it-tools/output/manual.docx
@@ -197,7 +197,7 @@
         <w:t xml:space="preserve">성공 기준: </w:t>
       </w:r>
       <w:r>
-        <w:t>示例 JSON 输入后，输出区域显示对应 YAML。该结果已在 IT Tools 公开部署页面观察到。</w:t>
+        <w:t>예시 JSON을 입력하면 출력 영역에 해당 YAML이 표시된다. 이 결과는 IT Tools 공개 배포 페이지에서 관찰했다.</w:t>
       </w:r>
     </w:p>
     <w:p>
@@ -255,7 +255,7 @@
         <w:t xml:space="preserve">예상 결과: </w:t>
       </w:r>
       <w:r>
-        <w:t>显示 JSON to YAML 工具标题和输入区域。</w:t>
+        <w:t>JSON to YAML 도구의 제목과 입력 영역이 표시된다.</w:t>
       </w:r>
     </w:p>
     <w:p>
@@ -269,7 +269,7 @@
         <w:t xml:space="preserve">실제 결과: </w:t>
       </w:r>
       <w:r>
-        <w:t>已打开 JSON to YAML converter 页面，显示标题和 JSON 输入区域。</w:t>
+        <w:t>JSON to YAML converter 페이지를 열어 제목과 JSON 입력 영역을 확인했다.</w:t>
       </w:r>
     </w:p>
     <w:p>
@@ -361,7 +361,7 @@
         <w:t xml:space="preserve">예상 결과: </w:t>
       </w:r>
       <w:r>
-        <w:t>输入框保留示例 JSON 内容。</w:t>
+        <w:t>입력란에 예시 JSON 내용이 유지된다.</w:t>
       </w:r>
     </w:p>
     <w:p>
@@ -375,7 +375,7 @@
         <w:t xml:space="preserve">실제 결과: </w:t>
       </w:r>
       <w:r>
-        <w:t>输入 {"service":"demo","enabled":true} 后，内容显示在 JSON 输入区域。</w:t>
+        <w:t>{"service":"demo","enabled":true}를 입력한 뒤 JSON 입력 영역에 내용이 표시되는 것을 확인했다.</w:t>
       </w:r>
     </w:p>
     <w:p>
@@ -467,7 +467,7 @@
         <w:t xml:space="preserve">예상 결과: </w:t>
       </w:r>
       <w:r>
-        <w:t>输出区显示等价的 YAML 文本。</w:t>
+        <w:t>출력 영역에 동등한 YAML 텍스트가 표시된다.</w:t>
       </w:r>
     </w:p>
     <w:p>
@@ -481,7 +481,7 @@
         <w:t xml:space="preserve">실제 결과: </w:t>
       </w:r>
       <w:r>
-        <w:t>输出区域显示 service: demo 与 enabled: true 两行 YAML。</w:t>
+        <w:t>출력 영역에 service: demo와 enabled: true의 YAML 두 줄이 표시되는 것을 확인했다.</w:t>
       </w:r>
     </w:p>
     <w:p>
@@ -1231,7 +1231,7 @@
         <w:pStyle w:val="ListBullet"/>
       </w:pPr>
       <w:r>
-        <w:t>本手册的源码索引固定到 commit d505845f918e946ec300af7b36efc107e2f66e9e；实测截图取自 IT Tools 公开部署页面，部署版本未与固定源码 commit 对齐。</w:t>
+        <w:t>이 설명서의 소스 코드 색인은 commit d505845f918e946ec300af7b36efc107e2f66e9e에 고정되어 있다. 실제 스크린샷은 IT Tools 공개 배포 페이지에서 가져왔으며 배포 버전과 고정한 소스 commit의 일치 여부는 확인하지 못했다.</w:t>
       </w:r>
     </w:p>
     <w:p>
@@ -1239,7 +1239,7 @@
         <w:pStyle w:val="ListBullet"/>
       </w:pPr>
       <w:r>
-        <w:t>仅 JSON→YAML 转换流程已在公开部署页面观察并截图验证；文本哈希和 QR 码流程仍为源码候选，未经界面操作验证。</w:t>
+        <w:t>JSON→YAML 변환 흐름만 공개 배포 페이지에서 관찰하고 스크린샷으로 검증했다. 텍스트 해시와 QR 코드 흐름은 소스 코드에서 추린 후보이며 UI에서 실제로 실행해 검증하지 않았다.</w:t>
       </w:r>
     </w:p>
     <w:sectPr>

</xml_diff>